<commit_message>
The characters: one table for every mission, pixel-art portraits with three faces
js/01y: every character once - name, letter, colours, mumble, who they are,
how they look and the recipe of their portrait; the missions name them by id.
tools/portraits.py draws the portraits (48 x 48, 3/4 view, calm, angry and
smiling, on a ground glowing in the bubble colour) into img/chars and writes
the Word sheet docs/Characters.docx; the dialogue and the live lines pick the
face by the line's mood, with sharp pixels. tools/characters_sheet.py edits
the table in Numbers or Excel. The quest pages show the drawn portraits.

Co-Authored-By: Claude <noreply@anthropic.com>
Claude-Session: https://claude.ai/code/session_01RpWbq89r71C1p9HP7EcbZ5
</commit_message>
<xml_diff>
--- a/docs/quests/Quest-02-Dock-Rats.docx
+++ b/docs/quests/Quest-02-Dock-Rats.docx
@@ -1168,60 +1168,39 @@
                   </w:r>
                 </w:p>
                 <w:p>
-                  <w:pPr>
-                    <w:spacing w:after="40" w:before="0"/>
-                    <w:jc w:val="center"/>
-                  </w:pPr>
                   <w:r>
-                    <w:rPr>
-                      <w:rFonts w:ascii="Arial" w:cs="Arial" w:eastAsia="Arial" w:hAnsi="Arial"/>
-                      <w:b/>
-                      <w:bCs/>
-                      <w:i/>
-                      <w:iCs/>
-                      <w:color w:val="8A8F98"/>
-                      <w:sz w:val="18"/>
-                      <w:szCs w:val="18"/>
-                    </w:rPr>
-                    <w:t>marco.png</w:t>
-                  </w:r>
-                </w:p>
-                <w:p>
-                  <w:pPr>
-                    <w:spacing w:after="40" w:before="0"/>
-                    <w:jc w:val="center"/>
-                  </w:pPr>
-                  <w:r>
-                    <w:rPr>
-                      <w:rFonts w:ascii="Arial" w:cs="Arial" w:eastAsia="Arial" w:hAnsi="Arial"/>
-                      <w:b/>
-                      <w:bCs/>
-                      <w:i/>
-                      <w:iCs/>
-                      <w:color w:val="8A8F98"/>
-                      <w:sz w:val="18"/>
-                      <w:szCs w:val="18"/>
-                    </w:rPr>
-                    <w:t>square PNG, about 512 px</w:t>
-                  </w:r>
-                </w:p>
-                <w:p>
-                  <w:pPr>
-                    <w:spacing w:after="40" w:before="0"/>
-                    <w:jc w:val="center"/>
-                  </w:pPr>
-                  <w:r>
-                    <w:rPr>
-                      <w:rFonts w:ascii="Arial" w:cs="Arial" w:eastAsia="Arial" w:hAnsi="Arial"/>
-                      <w:b/>
-                      <w:bCs/>
-                      <w:i/>
-                      <w:iCs/>
-                      <w:color w:val="8A8F98"/>
-                      <w:sz w:val="18"/>
-                      <w:szCs w:val="18"/>
-                    </w:rPr>
-                    <w:t>head and shoulders</w:t>
+                    <w:drawing>
+                      <wp:inline xmlns:a="http://schemas.openxmlformats.org/drawingml/2006/main" xmlns:pic="http://schemas.openxmlformats.org/drawingml/2006/picture">
+                        <wp:extent cx="936000" cy="936000"/>
+                        <wp:docPr id="1" name="Picture 1"/>
+                        <wp:cNvGraphicFramePr>
+                          <a:graphicFrameLocks noChangeAspect="1"/>
+                        </wp:cNvGraphicFramePr>
+                        <a:graphic>
+                          <a:graphicData uri="http://schemas.openxmlformats.org/drawingml/2006/picture">
+                            <pic:pic>
+                              <pic:nvPicPr>
+                                <pic:cNvPr id="0" name="_marco-calm.png"/>
+                                <pic:cNvPicPr/>
+                              </pic:nvPicPr>
+                              <pic:blipFill>
+                                <a:blip r:embed="rId9"/>
+                                <a:stretch>
+                                  <a:fillRect/>
+                                </a:stretch>
+                              </pic:blipFill>
+                              <pic:spPr>
+                                <a:xfrm>
+                                  <a:off x="0" y="0"/>
+                                  <a:ext cx="936000" cy="936000"/>
+                                </a:xfrm>
+                                <a:prstGeom prst="rect"/>
+                              </pic:spPr>
+                            </pic:pic>
+                          </a:graphicData>
+                        </a:graphic>
+                      </wp:inline>
+                    </w:drawing>
                   </w:r>
                 </w:p>
               </w:tc>
@@ -1731,7 +1710,7 @@
                       <w:sz w:val="18"/>
                       <w:szCs w:val="18"/>
                     </w:rPr>
-                    <w:t>marco.png</w:t>
+                    <w:t>marco-calm.png</w:t>
                   </w:r>
                 </w:p>
               </w:tc>
@@ -1938,60 +1917,39 @@
                   </w:r>
                 </w:p>
                 <w:p>
-                  <w:pPr>
-                    <w:spacing w:after="40" w:before="0"/>
-                    <w:jc w:val="center"/>
-                  </w:pPr>
                   <w:r>
-                    <w:rPr>
-                      <w:rFonts w:ascii="Arial" w:cs="Arial" w:eastAsia="Arial" w:hAnsi="Arial"/>
-                      <w:b/>
-                      <w:bCs/>
-                      <w:i/>
-                      <w:iCs/>
-                      <w:color w:val="8A8F98"/>
-                      <w:sz w:val="18"/>
-                      <w:szCs w:val="18"/>
-                    </w:rPr>
-                    <w:t>lucia.png</w:t>
-                  </w:r>
-                </w:p>
-                <w:p>
-                  <w:pPr>
-                    <w:spacing w:after="40" w:before="0"/>
-                    <w:jc w:val="center"/>
-                  </w:pPr>
-                  <w:r>
-                    <w:rPr>
-                      <w:rFonts w:ascii="Arial" w:cs="Arial" w:eastAsia="Arial" w:hAnsi="Arial"/>
-                      <w:b/>
-                      <w:bCs/>
-                      <w:i/>
-                      <w:iCs/>
-                      <w:color w:val="8A8F98"/>
-                      <w:sz w:val="18"/>
-                      <w:szCs w:val="18"/>
-                    </w:rPr>
-                    <w:t>square PNG, about 512 px</w:t>
-                  </w:r>
-                </w:p>
-                <w:p>
-                  <w:pPr>
-                    <w:spacing w:after="40" w:before="0"/>
-                    <w:jc w:val="center"/>
-                  </w:pPr>
-                  <w:r>
-                    <w:rPr>
-                      <w:rFonts w:ascii="Arial" w:cs="Arial" w:eastAsia="Arial" w:hAnsi="Arial"/>
-                      <w:b/>
-                      <w:bCs/>
-                      <w:i/>
-                      <w:iCs/>
-                      <w:color w:val="8A8F98"/>
-                      <w:sz w:val="18"/>
-                      <w:szCs w:val="18"/>
-                    </w:rPr>
-                    <w:t>head and shoulders</w:t>
+                    <w:drawing>
+                      <wp:inline xmlns:a="http://schemas.openxmlformats.org/drawingml/2006/main" xmlns:pic="http://schemas.openxmlformats.org/drawingml/2006/picture">
+                        <wp:extent cx="936000" cy="936000"/>
+                        <wp:docPr id="2" name="Picture 2"/>
+                        <wp:cNvGraphicFramePr>
+                          <a:graphicFrameLocks noChangeAspect="1"/>
+                        </wp:cNvGraphicFramePr>
+                        <a:graphic>
+                          <a:graphicData uri="http://schemas.openxmlformats.org/drawingml/2006/picture">
+                            <pic:pic>
+                              <pic:nvPicPr>
+                                <pic:cNvPr id="0" name="_lucia-calm.png"/>
+                                <pic:cNvPicPr/>
+                              </pic:nvPicPr>
+                              <pic:blipFill>
+                                <a:blip r:embed="rId10"/>
+                                <a:stretch>
+                                  <a:fillRect/>
+                                </a:stretch>
+                              </pic:blipFill>
+                              <pic:spPr>
+                                <a:xfrm>
+                                  <a:off x="0" y="0"/>
+                                  <a:ext cx="936000" cy="936000"/>
+                                </a:xfrm>
+                                <a:prstGeom prst="rect"/>
+                              </pic:spPr>
+                            </pic:pic>
+                          </a:graphicData>
+                        </a:graphic>
+                      </wp:inline>
+                    </w:drawing>
                   </w:r>
                 </w:p>
               </w:tc>
@@ -2501,7 +2459,7 @@
                       <w:sz w:val="18"/>
                       <w:szCs w:val="18"/>
                     </w:rPr>
-                    <w:t>lucia.png</w:t>
+                    <w:t>lucia-calm.png</w:t>
                   </w:r>
                 </w:p>
               </w:tc>
@@ -2708,60 +2666,39 @@
                   </w:r>
                 </w:p>
                 <w:p>
-                  <w:pPr>
-                    <w:spacing w:after="40" w:before="0"/>
-                    <w:jc w:val="center"/>
-                  </w:pPr>
                   <w:r>
-                    <w:rPr>
-                      <w:rFonts w:ascii="Arial" w:cs="Arial" w:eastAsia="Arial" w:hAnsi="Arial"/>
-                      <w:b/>
-                      <w:bCs/>
-                      <w:i/>
-                      <w:iCs/>
-                      <w:color w:val="8A8F98"/>
-                      <w:sz w:val="18"/>
-                      <w:szCs w:val="18"/>
-                    </w:rPr>
-                    <w:t>rocco.png</w:t>
-                  </w:r>
-                </w:p>
-                <w:p>
-                  <w:pPr>
-                    <w:spacing w:after="40" w:before="0"/>
-                    <w:jc w:val="center"/>
-                  </w:pPr>
-                  <w:r>
-                    <w:rPr>
-                      <w:rFonts w:ascii="Arial" w:cs="Arial" w:eastAsia="Arial" w:hAnsi="Arial"/>
-                      <w:b/>
-                      <w:bCs/>
-                      <w:i/>
-                      <w:iCs/>
-                      <w:color w:val="8A8F98"/>
-                      <w:sz w:val="18"/>
-                      <w:szCs w:val="18"/>
-                    </w:rPr>
-                    <w:t>square PNG, about 512 px</w:t>
-                  </w:r>
-                </w:p>
-                <w:p>
-                  <w:pPr>
-                    <w:spacing w:after="40" w:before="0"/>
-                    <w:jc w:val="center"/>
-                  </w:pPr>
-                  <w:r>
-                    <w:rPr>
-                      <w:rFonts w:ascii="Arial" w:cs="Arial" w:eastAsia="Arial" w:hAnsi="Arial"/>
-                      <w:b/>
-                      <w:bCs/>
-                      <w:i/>
-                      <w:iCs/>
-                      <w:color w:val="8A8F98"/>
-                      <w:sz w:val="18"/>
-                      <w:szCs w:val="18"/>
-                    </w:rPr>
-                    <w:t>head and shoulders</w:t>
+                    <w:drawing>
+                      <wp:inline xmlns:a="http://schemas.openxmlformats.org/drawingml/2006/main" xmlns:pic="http://schemas.openxmlformats.org/drawingml/2006/picture">
+                        <wp:extent cx="936000" cy="936000"/>
+                        <wp:docPr id="3" name="Picture 3"/>
+                        <wp:cNvGraphicFramePr>
+                          <a:graphicFrameLocks noChangeAspect="1"/>
+                        </wp:cNvGraphicFramePr>
+                        <a:graphic>
+                          <a:graphicData uri="http://schemas.openxmlformats.org/drawingml/2006/picture">
+                            <pic:pic>
+                              <pic:nvPicPr>
+                                <pic:cNvPr id="0" name="_rocco-calm.png"/>
+                                <pic:cNvPicPr/>
+                              </pic:nvPicPr>
+                              <pic:blipFill>
+                                <a:blip r:embed="rId11"/>
+                                <a:stretch>
+                                  <a:fillRect/>
+                                </a:stretch>
+                              </pic:blipFill>
+                              <pic:spPr>
+                                <a:xfrm>
+                                  <a:off x="0" y="0"/>
+                                  <a:ext cx="936000" cy="936000"/>
+                                </a:xfrm>
+                                <a:prstGeom prst="rect"/>
+                              </pic:spPr>
+                            </pic:pic>
+                          </a:graphicData>
+                        </a:graphic>
+                      </wp:inline>
+                    </w:drawing>
                   </w:r>
                 </w:p>
               </w:tc>
@@ -3271,7 +3208,7 @@
                       <w:sz w:val="18"/>
                       <w:szCs w:val="18"/>
                     </w:rPr>
-                    <w:t>rocco.png</w:t>
+                    <w:t>rocco-calm.png</w:t>
                   </w:r>
                 </w:p>
               </w:tc>
@@ -3478,60 +3415,39 @@
                   </w:r>
                 </w:p>
                 <w:p>
-                  <w:pPr>
-                    <w:spacing w:after="40" w:before="0"/>
-                    <w:jc w:val="center"/>
-                  </w:pPr>
                   <w:r>
-                    <w:rPr>
-                      <w:rFonts w:ascii="Arial" w:cs="Arial" w:eastAsia="Arial" w:hAnsi="Arial"/>
-                      <w:b/>
-                      <w:bCs/>
-                      <w:i/>
-                      <w:iCs/>
-                      <w:color w:val="8A8F98"/>
-                      <w:sz w:val="18"/>
-                      <w:szCs w:val="18"/>
-                    </w:rPr>
-                    <w:t>varga.png</w:t>
-                  </w:r>
-                </w:p>
-                <w:p>
-                  <w:pPr>
-                    <w:spacing w:after="40" w:before="0"/>
-                    <w:jc w:val="center"/>
-                  </w:pPr>
-                  <w:r>
-                    <w:rPr>
-                      <w:rFonts w:ascii="Arial" w:cs="Arial" w:eastAsia="Arial" w:hAnsi="Arial"/>
-                      <w:b/>
-                      <w:bCs/>
-                      <w:i/>
-                      <w:iCs/>
-                      <w:color w:val="8A8F98"/>
-                      <w:sz w:val="18"/>
-                      <w:szCs w:val="18"/>
-                    </w:rPr>
-                    <w:t>square PNG, about 512 px</w:t>
-                  </w:r>
-                </w:p>
-                <w:p>
-                  <w:pPr>
-                    <w:spacing w:after="40" w:before="0"/>
-                    <w:jc w:val="center"/>
-                  </w:pPr>
-                  <w:r>
-                    <w:rPr>
-                      <w:rFonts w:ascii="Arial" w:cs="Arial" w:eastAsia="Arial" w:hAnsi="Arial"/>
-                      <w:b/>
-                      <w:bCs/>
-                      <w:i/>
-                      <w:iCs/>
-                      <w:color w:val="8A8F98"/>
-                      <w:sz w:val="18"/>
-                      <w:szCs w:val="18"/>
-                    </w:rPr>
-                    <w:t>head and shoulders</w:t>
+                    <w:drawing>
+                      <wp:inline xmlns:a="http://schemas.openxmlformats.org/drawingml/2006/main" xmlns:pic="http://schemas.openxmlformats.org/drawingml/2006/picture">
+                        <wp:extent cx="936000" cy="936000"/>
+                        <wp:docPr id="4" name="Picture 4"/>
+                        <wp:cNvGraphicFramePr>
+                          <a:graphicFrameLocks noChangeAspect="1"/>
+                        </wp:cNvGraphicFramePr>
+                        <a:graphic>
+                          <a:graphicData uri="http://schemas.openxmlformats.org/drawingml/2006/picture">
+                            <pic:pic>
+                              <pic:nvPicPr>
+                                <pic:cNvPr id="0" name="_varga-calm.png"/>
+                                <pic:cNvPicPr/>
+                              </pic:nvPicPr>
+                              <pic:blipFill>
+                                <a:blip r:embed="rId12"/>
+                                <a:stretch>
+                                  <a:fillRect/>
+                                </a:stretch>
+                              </pic:blipFill>
+                              <pic:spPr>
+                                <a:xfrm>
+                                  <a:off x="0" y="0"/>
+                                  <a:ext cx="936000" cy="936000"/>
+                                </a:xfrm>
+                                <a:prstGeom prst="rect"/>
+                              </pic:spPr>
+                            </pic:pic>
+                          </a:graphicData>
+                        </a:graphic>
+                      </wp:inline>
+                    </w:drawing>
                   </w:r>
                 </w:p>
               </w:tc>
@@ -4041,7 +3957,7 @@
                       <w:sz w:val="18"/>
                       <w:szCs w:val="18"/>
                     </w:rPr>
-                    <w:t>varga.png</w:t>
+                    <w:t>varga-calm.png</w:t>
                   </w:r>
                 </w:p>
               </w:tc>
@@ -15391,7 +15307,7 @@
                 <w:sz w:val="18"/>
                 <w:szCs w:val="18"/>
               </w:rPr>
-              <w:t>marco.png</w:t>
+              <w:t>marco-calm / -angry / -smile.png</w:t>
             </w:r>
           </w:p>
         </w:tc>
@@ -15423,7 +15339,7 @@
                 <w:sz w:val="17"/>
                 <w:szCs w:val="17"/>
               </w:rPr>
-              <w:t>MARCO VALE - square PNG, about 512 px, head and shoulders, plain or see-through background</w:t>
+              <w:t>MARCO VALE - drawn (pixel art, 48 x 48, docs/Characters.docx); a picture of your own replaces them</w:t>
             </w:r>
           </w:p>
         </w:tc>
@@ -15460,7 +15376,7 @@
                 <w:sz w:val="18"/>
                 <w:szCs w:val="18"/>
               </w:rPr>
-              <w:t>lucia.png</w:t>
+              <w:t>lucia-calm / -angry / -smile.png</w:t>
             </w:r>
           </w:p>
         </w:tc>
@@ -15492,7 +15408,7 @@
                 <w:sz w:val="17"/>
                 <w:szCs w:val="17"/>
               </w:rPr>
-              <w:t>LUCIA VALE - square PNG, about 512 px, head and shoulders, plain or see-through background</w:t>
+              <w:t>LUCIA VALE - drawn (pixel art, 48 x 48, docs/Characters.docx); a picture of your own replaces them</w:t>
             </w:r>
           </w:p>
         </w:tc>
@@ -15529,7 +15445,7 @@
                 <w:sz w:val="18"/>
                 <w:szCs w:val="18"/>
               </w:rPr>
-              <w:t>rocco.png</w:t>
+              <w:t>rocco-calm / -angry / -smile.png</w:t>
             </w:r>
           </w:p>
         </w:tc>
@@ -15561,7 +15477,7 @@
                 <w:sz w:val="17"/>
                 <w:szCs w:val="17"/>
               </w:rPr>
-              <w:t>ROCCO - square PNG, about 512 px, head and shoulders, plain or see-through background</w:t>
+              <w:t>ROCCO - drawn (pixel art, 48 x 48, docs/Characters.docx); a picture of your own replaces them</w:t>
             </w:r>
           </w:p>
         </w:tc>
@@ -15598,7 +15514,7 @@
                 <w:sz w:val="18"/>
                 <w:szCs w:val="18"/>
               </w:rPr>
-              <w:t>varga.png</w:t>
+              <w:t>varga-calm / -angry / -smile.png</w:t>
             </w:r>
           </w:p>
         </w:tc>
@@ -15630,7 +15546,7 @@
                 <w:sz w:val="17"/>
                 <w:szCs w:val="17"/>
               </w:rPr>
-              <w:t>VARGA MAN - square PNG, about 512 px, head and shoulders, plain or see-through background</w:t>
+              <w:t>VARGA MAN - drawn (pixel art, 48 x 48, docs/Characters.docx); a picture of your own replaces them</w:t>
             </w:r>
           </w:p>
         </w:tc>

</xml_diff>